<commit_message>
Add title page with Ono logo and submitter name to the AI paper
Inserts a cover page with the Ono Academic College logo, faculty and degree
lines, the work title, course and semester, submitter name, and lecturer,
followed by a page break before the body. Body formatting unchanged (David 12,
1.5 spacing, justified, RTL).

Co-Authored-By: Claude Opus 4.8 <noreply@anthropic.com>
Claude-Session: https://claude.ai/code/session_01MbejiiQPfKjUm47n1NP4CY
</commit_message>
<xml_diff>
--- a/עבודה_מחקר_כמותי_בינה_מלאכותית_מסוגלות_מורים.docx
+++ b/עבודה_מחקר_כמותי_בינה_מלאכותית_מסוגלות_מורים.docx
@@ -2,6 +2,226 @@
 <file path=word/document.xml><?xml version="1.0" encoding="utf-8"?>
 <w:document xmlns:wpc="http://schemas.microsoft.com/office/word/2010/wordprocessingCanvas" xmlns:mo="http://schemas.microsoft.com/office/mac/office/2008/main" xmlns:mc="http://schemas.openxmlformats.org/markup-compatibility/2006" xmlns:mv="urn:schemas-microsoft-com:mac:vml" xmlns:o="urn:schemas-microsoft-com:office:office" xmlns:r="http://schemas.openxmlformats.org/officeDocument/2006/relationships" xmlns:m="http://schemas.openxmlformats.org/officeDocument/2006/math" xmlns:v="urn:schemas-microsoft-com:vml" xmlns:wp14="http://schemas.microsoft.com/office/word/2010/wordprocessingDrawing" xmlns:wp="http://schemas.openxmlformats.org/drawingml/2006/wordprocessingDrawing" xmlns:w10="urn:schemas-microsoft-com:office:word" xmlns:w="http://schemas.openxmlformats.org/wordprocessingml/2006/main" xmlns:w14="http://schemas.microsoft.com/office/word/2010/wordml" xmlns:wpg="http://schemas.microsoft.com/office/word/2010/wordprocessingGroup" xmlns:wpi="http://schemas.microsoft.com/office/word/2010/wordprocessingInk" xmlns:wne="http://schemas.microsoft.com/office/word/2006/wordml" xmlns:wps="http://schemas.microsoft.com/office/word/2010/wordprocessingShape" mc:Ignorable="w14 wp14">
   <w:body>
+    <w:p>
+      <w:pPr>
+        <w:bidi w:val="true"/>
+        <w:spacing w:lineRule="auto" w:line="360" w:after="120" w:before="0"/>
+        <w:jc w:val="center"/>
+      </w:pPr>
+      <w:r>
+        <w:rPr>
+          <w:rFonts w:ascii="David" w:hAnsi="David" w:cs="David"/>
+          <w:b w:val="0"/>
+          <w:sz w:val="24"/>
+          <w:szCs w:val="24"/>
+          <w:rtl w:val="true"/>
+        </w:rPr>
+      </w:r>
+    </w:p>
+    <w:p>
+      <w:pPr>
+        <w:bidi w:val="true"/>
+        <w:spacing w:lineRule="auto" w:line="360" w:after="280" w:before="0"/>
+        <w:jc w:val="center"/>
+      </w:pPr>
+      <w:r>
+        <w:drawing>
+          <wp:inline xmlns:a="http://schemas.openxmlformats.org/drawingml/2006/main" xmlns:pic="http://schemas.openxmlformats.org/drawingml/2006/picture">
+            <wp:extent cx="1872000" cy="1872000"/>
+            <wp:docPr id="1" name="Picture 1"/>
+            <wp:cNvGraphicFramePr>
+              <a:graphicFrameLocks noChangeAspect="1"/>
+            </wp:cNvGraphicFramePr>
+            <a:graphic>
+              <a:graphicData uri="http://schemas.openxmlformats.org/drawingml/2006/picture">
+                <pic:pic>
+                  <pic:nvPicPr>
+                    <pic:cNvPr id="0" name="66411cfa-IMG_3708.jpeg"/>
+                    <pic:cNvPicPr/>
+                  </pic:nvPicPr>
+                  <pic:blipFill>
+                    <a:blip r:embed="rId9"/>
+                    <a:stretch>
+                      <a:fillRect/>
+                    </a:stretch>
+                  </pic:blipFill>
+                  <pic:spPr>
+                    <a:xfrm>
+                      <a:off x="0" y="0"/>
+                      <a:ext cx="1872000" cy="1872000"/>
+                    </a:xfrm>
+                    <a:prstGeom prst="rect"/>
+                  </pic:spPr>
+                </pic:pic>
+              </a:graphicData>
+            </a:graphic>
+          </wp:inline>
+        </w:drawing>
+      </w:r>
+    </w:p>
+    <w:p>
+      <w:pPr>
+        <w:bidi w:val="true"/>
+        <w:spacing w:lineRule="auto" w:line="360" w:after="60" w:before="0"/>
+        <w:jc w:val="center"/>
+      </w:pPr>
+      <w:r>
+        <w:rPr>
+          <w:rFonts w:ascii="David" w:hAnsi="David" w:cs="David"/>
+          <w:b/>
+          <w:sz w:val="30"/>
+          <w:szCs w:val="30"/>
+          <w:rtl w:val="true"/>
+        </w:rPr>
+        <w:t>הקריה האקדמית אונו</w:t>
+      </w:r>
+    </w:p>
+    <w:p>
+      <w:pPr>
+        <w:bidi w:val="true"/>
+        <w:spacing w:lineRule="auto" w:line="360" w:after="40" w:before="0"/>
+        <w:jc w:val="center"/>
+      </w:pPr>
+      <w:r>
+        <w:rPr>
+          <w:rFonts w:ascii="David" w:hAnsi="David" w:cs="David"/>
+          <w:b/>
+          <w:sz w:val="26"/>
+          <w:szCs w:val="26"/>
+          <w:rtl w:val="true"/>
+        </w:rPr>
+        <w:t>הפקולטה למדעי הרוח והחברה</w:t>
+      </w:r>
+    </w:p>
+    <w:p>
+      <w:pPr>
+        <w:bidi w:val="true"/>
+        <w:spacing w:lineRule="auto" w:line="360" w:after="800" w:before="0"/>
+        <w:jc w:val="center"/>
+      </w:pPr>
+      <w:r>
+        <w:rPr>
+          <w:rFonts w:ascii="David" w:hAnsi="David" w:cs="David"/>
+          <w:b w:val="0"/>
+          <w:sz w:val="24"/>
+          <w:szCs w:val="24"/>
+          <w:rtl w:val="true"/>
+        </w:rPr>
+        <w:t>לימודים לתואר מוסמך</w:t>
+      </w:r>
+    </w:p>
+    <w:p>
+      <w:pPr>
+        <w:bidi w:val="true"/>
+        <w:spacing w:lineRule="auto" w:line="360" w:after="120" w:before="0"/>
+        <w:jc w:val="center"/>
+      </w:pPr>
+      <w:r>
+        <w:rPr>
+          <w:rFonts w:ascii="David" w:hAnsi="David" w:cs="David"/>
+          <w:b/>
+          <w:sz w:val="36"/>
+          <w:szCs w:val="36"/>
+          <w:rtl w:val="true"/>
+        </w:rPr>
+        <w:t>אפיון מחקר כמותי בחינוך</w:t>
+      </w:r>
+    </w:p>
+    <w:p>
+      <w:pPr>
+        <w:bidi w:val="true"/>
+        <w:spacing w:lineRule="auto" w:line="360" w:after="880" w:before="0"/>
+        <w:jc w:val="center"/>
+      </w:pPr>
+      <w:r>
+        <w:rPr>
+          <w:rFonts w:ascii="David" w:hAnsi="David" w:cs="David"/>
+          <w:b/>
+          <w:sz w:val="26"/>
+          <w:szCs w:val="26"/>
+          <w:rtl w:val="true"/>
+        </w:rPr>
+        <w:t>השפעת מידת השימוש בכלי בינה מלאכותית יוצרת על תחושת המסוגלות העצמית המקצועית של מורים</w:t>
+      </w:r>
+    </w:p>
+    <w:p>
+      <w:pPr>
+        <w:bidi w:val="true"/>
+        <w:spacing w:lineRule="auto" w:line="360" w:after="60" w:before="0"/>
+        <w:jc w:val="center"/>
+      </w:pPr>
+      <w:r>
+        <w:rPr>
+          <w:rFonts w:ascii="David" w:hAnsi="David" w:cs="David"/>
+          <w:b w:val="0"/>
+          <w:sz w:val="24"/>
+          <w:szCs w:val="24"/>
+          <w:rtl w:val="true"/>
+        </w:rPr>
+        <w:t>עבודה מסכמת בקורס "מחקר מתקדם בחינוך (שיטות מחקר כמותיות)"</w:t>
+      </w:r>
+    </w:p>
+    <w:p>
+      <w:pPr>
+        <w:bidi w:val="true"/>
+        <w:spacing w:lineRule="auto" w:line="360" w:after="600" w:before="0"/>
+        <w:jc w:val="center"/>
+      </w:pPr>
+      <w:r>
+        <w:rPr>
+          <w:rFonts w:ascii="David" w:hAnsi="David" w:cs="David"/>
+          <w:b w:val="0"/>
+          <w:sz w:val="24"/>
+          <w:szCs w:val="24"/>
+          <w:rtl w:val="true"/>
+        </w:rPr>
+        <w:t>סמסטר ב' תשפ"ו</w:t>
+      </w:r>
+    </w:p>
+    <w:p>
+      <w:pPr>
+        <w:bidi w:val="true"/>
+        <w:spacing w:lineRule="auto" w:line="360" w:after="80" w:before="0"/>
+        <w:jc w:val="center"/>
+      </w:pPr>
+      <w:r>
+        <w:rPr>
+          <w:rFonts w:ascii="David" w:hAnsi="David" w:cs="David"/>
+          <w:b/>
+          <w:sz w:val="28"/>
+          <w:szCs w:val="28"/>
+          <w:rtl w:val="true"/>
+        </w:rPr>
+        <w:t>מגישה: גאסיקה</w:t>
+      </w:r>
+    </w:p>
+    <w:p>
+      <w:pPr>
+        <w:bidi w:val="true"/>
+        <w:spacing w:lineRule="auto" w:line="360" w:after="80" w:before="0"/>
+        <w:jc w:val="center"/>
+      </w:pPr>
+      <w:r>
+        <w:rPr>
+          <w:rFonts w:ascii="David" w:hAnsi="David" w:cs="David"/>
+          <w:b w:val="0"/>
+          <w:sz w:val="24"/>
+          <w:szCs w:val="24"/>
+          <w:rtl w:val="true"/>
+        </w:rPr>
+        <w:t>מרצה: ד"ר אילן דניאלס רחימי</w:t>
+      </w:r>
+    </w:p>
+    <w:p>
+      <w:pPr>
+        <w:bidi w:val="true"/>
+        <w:spacing w:lineRule="auto" w:line="360" w:after="0" w:before="0"/>
+        <w:jc w:val="both"/>
+      </w:pPr>
+      <w:r>
+        <w:br w:type="page"/>
+      </w:r>
+    </w:p>
     <w:p>
       <w:pPr>
         <w:bidi w:val="true"/>
@@ -22,7 +242,7 @@
     <w:p>
       <w:pPr>
         <w:bidi w:val="true"/>
-        <w:spacing w:lineRule="auto" w:line="360" w:after="20" w:before="0"/>
+        <w:spacing w:lineRule="auto" w:line="360" w:after="160" w:before="0"/>
         <w:jc w:val="center"/>
       </w:pPr>
       <w:r>
@@ -34,23 +254,6 @@
           <w:rtl w:val="true"/>
         </w:rPr>
         <w:t>השפעת מידת השימוש בכלי בינה מלאכותית יוצרת על תחושת המסוגלות העצמית המקצועית של מורים</w:t>
-      </w:r>
-    </w:p>
-    <w:p>
-      <w:pPr>
-        <w:bidi w:val="true"/>
-        <w:spacing w:lineRule="auto" w:line="360" w:after="160" w:before="0"/>
-        <w:jc w:val="center"/>
-      </w:pPr>
-      <w:r>
-        <w:rPr>
-          <w:rFonts w:ascii="David" w:hAnsi="David" w:cs="David"/>
-          <w:b w:val="0"/>
-          <w:sz w:val="22"/>
-          <w:szCs w:val="22"/>
-          <w:rtl w:val="true"/>
-        </w:rPr>
-        <w:t>עבודה מסכמת בקורס "מחקר מתקדם בחינוך (שיטות מחקר כמותיות)"  |  סמסטר ב' תשפ"ו</w:t>
       </w:r>
     </w:p>
     <w:p>

</xml_diff>